<commit_message>
updated pre build scan
</commit_message>
<xml_diff>
--- a/Automate Full Stack Application.docx
+++ b/Automate Full Stack Application.docx
@@ -82,7 +82,21 @@
         <w:rPr>
           <w:rFonts w:ascii="Times New Roman" w:hAnsi="Times New Roman" w:cs="Times New Roman"/>
         </w:rPr>
-        <w:t xml:space="preserve">After creating project folder I create a </w:t>
+        <w:t xml:space="preserve">After creating project </w:t>
+      </w:r>
+      <w:proofErr w:type="gramStart"/>
+      <w:r>
+        <w:rPr>
+          <w:rFonts w:ascii="Times New Roman" w:hAnsi="Times New Roman" w:cs="Times New Roman"/>
+        </w:rPr>
+        <w:t>folder</w:t>
+      </w:r>
+      <w:proofErr w:type="gramEnd"/>
+      <w:r>
+        <w:rPr>
+          <w:rFonts w:ascii="Times New Roman" w:hAnsi="Times New Roman" w:cs="Times New Roman"/>
+        </w:rPr>
+        <w:t xml:space="preserve"> I create a </w:t>
       </w:r>
       <w:r>
         <w:rPr>
@@ -705,7 +719,25 @@
           <w:b/>
           <w:bCs/>
         </w:rPr>
-        <w:t>').config();</w:t>
+        <w:t>').</w:t>
+      </w:r>
+      <w:proofErr w:type="gramStart"/>
+      <w:r>
+        <w:rPr>
+          <w:rFonts w:ascii="Times New Roman" w:hAnsi="Times New Roman" w:cs="Times New Roman"/>
+          <w:b/>
+          <w:bCs/>
+        </w:rPr>
+        <w:t>config(</w:t>
+      </w:r>
+      <w:proofErr w:type="gramEnd"/>
+      <w:r>
+        <w:rPr>
+          <w:rFonts w:ascii="Times New Roman" w:hAnsi="Times New Roman" w:cs="Times New Roman"/>
+          <w:b/>
+          <w:bCs/>
+        </w:rPr>
+        <w:t>);</w:t>
       </w:r>
       <w:r>
         <w:rPr>
@@ -791,7 +823,21 @@
         <w:rPr>
           <w:rFonts w:ascii="Times New Roman" w:hAnsi="Times New Roman" w:cs="Times New Roman"/>
         </w:rPr>
-        <w:t xml:space="preserve">After that I create models folder inside server folder and inside it I create user.js file for </w:t>
+        <w:t xml:space="preserve">After that I create </w:t>
+      </w:r>
+      <w:proofErr w:type="gramStart"/>
+      <w:r>
+        <w:rPr>
+          <w:rFonts w:ascii="Times New Roman" w:hAnsi="Times New Roman" w:cs="Times New Roman"/>
+        </w:rPr>
+        <w:t>models</w:t>
+      </w:r>
+      <w:proofErr w:type="gramEnd"/>
+      <w:r>
+        <w:rPr>
+          <w:rFonts w:ascii="Times New Roman" w:hAnsi="Times New Roman" w:cs="Times New Roman"/>
+        </w:rPr>
+        <w:t xml:space="preserve"> folder inside server folder and inside it I create user.js file for </w:t>
       </w:r>
     </w:p>
     <w:p>
@@ -1001,8 +1047,18 @@
           <w:b/>
           <w:bCs/>
         </w:rPr>
-        <w:t xml:space="preserve"> create-react-app .</w:t>
-      </w:r>
+        <w:t xml:space="preserve"> create-react-</w:t>
+      </w:r>
+      <w:proofErr w:type="gramStart"/>
+      <w:r>
+        <w:rPr>
+          <w:rFonts w:ascii="Times New Roman" w:hAnsi="Times New Roman" w:cs="Times New Roman"/>
+          <w:b/>
+          <w:bCs/>
+        </w:rPr>
+        <w:t>app .</w:t>
+      </w:r>
+      <w:proofErr w:type="gramEnd"/>
       <w:r>
         <w:rPr>
           <w:rFonts w:ascii="Times New Roman" w:hAnsi="Times New Roman" w:cs="Times New Roman"/>
@@ -1213,7 +1269,14 @@
           <w:rFonts w:ascii="Times New Roman" w:hAnsi="Times New Roman" w:cs="Times New Roman"/>
         </w:rPr>
         <w:lastRenderedPageBreak/>
-        <w:t xml:space="preserve">import { </w:t>
+        <w:t xml:space="preserve">import </w:t>
+      </w:r>
+      <w:proofErr w:type="gramStart"/>
+      <w:r>
+        <w:rPr>
+          <w:rFonts w:ascii="Times New Roman" w:hAnsi="Times New Roman" w:cs="Times New Roman"/>
+        </w:rPr>
+        <w:t xml:space="preserve">{ </w:t>
       </w:r>
       <w:proofErr w:type="spellStart"/>
       <w:r>
@@ -1223,6 +1286,7 @@
         <w:t>useEffect</w:t>
       </w:r>
       <w:proofErr w:type="spellEnd"/>
+      <w:proofErr w:type="gramEnd"/>
       <w:r>
         <w:rPr>
           <w:rFonts w:ascii="Times New Roman" w:hAnsi="Times New Roman" w:cs="Times New Roman"/>
@@ -1230,6 +1294,7 @@
         <w:t xml:space="preserve">, </w:t>
       </w:r>
       <w:proofErr w:type="spellStart"/>
+      <w:proofErr w:type="gramStart"/>
       <w:r>
         <w:rPr>
           <w:rFonts w:ascii="Times New Roman" w:hAnsi="Times New Roman" w:cs="Times New Roman"/>
@@ -1241,7 +1306,14 @@
         <w:rPr>
           <w:rFonts w:ascii="Times New Roman" w:hAnsi="Times New Roman" w:cs="Times New Roman"/>
         </w:rPr>
-        <w:t xml:space="preserve"> } from "react";</w:t>
+        <w:t xml:space="preserve"> }</w:t>
+      </w:r>
+      <w:proofErr w:type="gramEnd"/>
+      <w:r>
+        <w:rPr>
+          <w:rFonts w:ascii="Times New Roman" w:hAnsi="Times New Roman" w:cs="Times New Roman"/>
+        </w:rPr>
+        <w:t xml:space="preserve"> from "react";</w:t>
       </w:r>
     </w:p>
     <w:p>
@@ -1421,7 +1493,21 @@
         <w:rPr>
           <w:rFonts w:ascii="Times New Roman" w:hAnsi="Times New Roman" w:cs="Times New Roman"/>
         </w:rPr>
-        <w:t xml:space="preserve">And also I create </w:t>
+        <w:t xml:space="preserve">And </w:t>
+      </w:r>
+      <w:proofErr w:type="gramStart"/>
+      <w:r>
+        <w:rPr>
+          <w:rFonts w:ascii="Times New Roman" w:hAnsi="Times New Roman" w:cs="Times New Roman"/>
+        </w:rPr>
+        <w:t>also</w:t>
+      </w:r>
+      <w:proofErr w:type="gramEnd"/>
+      <w:r>
+        <w:rPr>
+          <w:rFonts w:ascii="Times New Roman" w:hAnsi="Times New Roman" w:cs="Times New Roman"/>
+        </w:rPr>
+        <w:t xml:space="preserve"> I create </w:t>
       </w:r>
       <w:r>
         <w:rPr>
@@ -1465,11 +1551,19 @@
         </w:rPr>
         <w:t xml:space="preserve"> </w:t>
       </w:r>
-      <w:r>
-        <w:rPr>
-          <w:rFonts w:ascii="Times New Roman" w:hAnsi="Times New Roman" w:cs="Times New Roman"/>
-        </w:rPr>
-        <w:t xml:space="preserve">its find routes in </w:t>
+      <w:proofErr w:type="gramStart"/>
+      <w:r>
+        <w:rPr>
+          <w:rFonts w:ascii="Times New Roman" w:hAnsi="Times New Roman" w:cs="Times New Roman"/>
+        </w:rPr>
+        <w:t>its</w:t>
+      </w:r>
+      <w:proofErr w:type="gramEnd"/>
+      <w:r>
+        <w:rPr>
+          <w:rFonts w:ascii="Times New Roman" w:hAnsi="Times New Roman" w:cs="Times New Roman"/>
+        </w:rPr>
+        <w:t xml:space="preserve"> find routes in </w:t>
       </w:r>
       <w:r>
         <w:rPr>
@@ -2671,6 +2765,7 @@
         <w:t xml:space="preserve"> ci = clean install based on package-</w:t>
       </w:r>
       <w:proofErr w:type="spellStart"/>
+      <w:proofErr w:type="gramStart"/>
       <w:r>
         <w:rPr>
           <w:rFonts w:ascii="Times New Roman" w:hAnsi="Times New Roman" w:cs="Times New Roman"/>
@@ -2678,6 +2773,7 @@
         <w:t>lock.json</w:t>
       </w:r>
       <w:proofErr w:type="spellEnd"/>
+      <w:proofErr w:type="gramEnd"/>
       <w:r>
         <w:rPr>
           <w:rFonts w:ascii="Times New Roman" w:hAnsi="Times New Roman" w:cs="Times New Roman"/>
@@ -3034,7 +3130,25 @@
           <w:b/>
           <w:bCs/>
         </w:rPr>
-        <w:t>Docker will automatically restart the container if it crashes, But won’t restart if you manually stop it.</w:t>
+        <w:t xml:space="preserve">Docker will automatically restart the container if it crashes, </w:t>
+      </w:r>
+      <w:proofErr w:type="gramStart"/>
+      <w:r>
+        <w:rPr>
+          <w:rFonts w:ascii="Times New Roman" w:hAnsi="Times New Roman" w:cs="Times New Roman"/>
+          <w:b/>
+          <w:bCs/>
+        </w:rPr>
+        <w:t>But</w:t>
+      </w:r>
+      <w:proofErr w:type="gramEnd"/>
+      <w:r>
+        <w:rPr>
+          <w:rFonts w:ascii="Times New Roman" w:hAnsi="Times New Roman" w:cs="Times New Roman"/>
+          <w:b/>
+          <w:bCs/>
+        </w:rPr>
+        <w:t xml:space="preserve"> won’t restart if you manually stop it.</w:t>
       </w:r>
     </w:p>
     <w:p>
@@ -3180,7 +3294,21 @@
         <w:rPr>
           <w:rFonts w:ascii="Times New Roman" w:hAnsi="Times New Roman" w:cs="Times New Roman"/>
         </w:rPr>
-        <w:t>After I hide this ports using env file, I created env file on</w:t>
+        <w:t xml:space="preserve">After I hide </w:t>
+      </w:r>
+      <w:proofErr w:type="gramStart"/>
+      <w:r>
+        <w:rPr>
+          <w:rFonts w:ascii="Times New Roman" w:hAnsi="Times New Roman" w:cs="Times New Roman"/>
+        </w:rPr>
+        <w:t>this ports</w:t>
+      </w:r>
+      <w:proofErr w:type="gramEnd"/>
+      <w:r>
+        <w:rPr>
+          <w:rFonts w:ascii="Times New Roman" w:hAnsi="Times New Roman" w:cs="Times New Roman"/>
+        </w:rPr>
+        <w:t xml:space="preserve"> using env file, I created env file on</w:t>
       </w:r>
       <w:r>
         <w:rPr>
@@ -3309,7 +3437,31 @@
           <w:szCs w:val="21"/>
           <w14:ligatures w14:val="none"/>
         </w:rPr>
-        <w:t>"${NGINX_HOST_PORT}:${NGINX_CONTAINER_PORT}"</w:t>
+        <w:t>"${NGINX_HOST_PORT</w:t>
+      </w:r>
+      <w:proofErr w:type="gramStart"/>
+      <w:r>
+        <w:rPr>
+          <w:rFonts w:ascii="Consolas" w:eastAsia="Times New Roman" w:hAnsi="Consolas" w:cs="Times New Roman"/>
+          <w:color w:val="A5D6FF"/>
+          <w:kern w:val="0"/>
+          <w:sz w:val="21"/>
+          <w:szCs w:val="21"/>
+          <w14:ligatures w14:val="none"/>
+        </w:rPr>
+        <w:t>}:$</w:t>
+      </w:r>
+      <w:proofErr w:type="gramEnd"/>
+      <w:r>
+        <w:rPr>
+          <w:rFonts w:ascii="Consolas" w:eastAsia="Times New Roman" w:hAnsi="Consolas" w:cs="Times New Roman"/>
+          <w:color w:val="A5D6FF"/>
+          <w:kern w:val="0"/>
+          <w:sz w:val="21"/>
+          <w:szCs w:val="21"/>
+          <w14:ligatures w14:val="none"/>
+        </w:rPr>
+        <w:t>{NGINX_CONTAINER_PORT}"</w:t>
       </w:r>
     </w:p>
     <w:p>
@@ -3408,6 +3560,7 @@
         </w:rPr>
       </w:pPr>
       <w:proofErr w:type="spellStart"/>
+      <w:proofErr w:type="gramStart"/>
       <w:r>
         <w:rPr>
           <w:rFonts w:ascii="Times New Roman" w:hAnsi="Times New Roman" w:cs="Times New Roman"/>
@@ -3415,6 +3568,7 @@
         <w:t>Finnaly</w:t>
       </w:r>
       <w:proofErr w:type="spellEnd"/>
+      <w:proofErr w:type="gramEnd"/>
       <w:r>
         <w:rPr>
           <w:rFonts w:ascii="Times New Roman" w:hAnsi="Times New Roman" w:cs="Times New Roman"/>
@@ -3732,7 +3886,21 @@
         <w:rPr>
           <w:rFonts w:ascii="Times New Roman" w:hAnsi="Times New Roman" w:cs="Times New Roman"/>
         </w:rPr>
-        <w:t xml:space="preserve"> (example : </w:t>
+        <w:t xml:space="preserve"> (</w:t>
+      </w:r>
+      <w:proofErr w:type="gramStart"/>
+      <w:r>
+        <w:rPr>
+          <w:rFonts w:ascii="Times New Roman" w:hAnsi="Times New Roman" w:cs="Times New Roman"/>
+        </w:rPr>
+        <w:t>example :</w:t>
+      </w:r>
+      <w:proofErr w:type="gramEnd"/>
+      <w:r>
+        <w:rPr>
+          <w:rFonts w:ascii="Times New Roman" w:hAnsi="Times New Roman" w:cs="Times New Roman"/>
+        </w:rPr>
+        <w:t xml:space="preserve"> </w:t>
       </w:r>
       <w:r>
         <w:rPr>
@@ -4441,7 +4609,21 @@
         <w:rPr>
           <w:rFonts w:ascii="Times New Roman" w:hAnsi="Times New Roman" w:cs="Times New Roman"/>
         </w:rPr>
-        <w:t xml:space="preserve">Accidentally pushed .env </w:t>
+        <w:t xml:space="preserve">Accidentally </w:t>
+      </w:r>
+      <w:proofErr w:type="gramStart"/>
+      <w:r>
+        <w:rPr>
+          <w:rFonts w:ascii="Times New Roman" w:hAnsi="Times New Roman" w:cs="Times New Roman"/>
+        </w:rPr>
+        <w:t>pushed .env</w:t>
+      </w:r>
+      <w:proofErr w:type="gramEnd"/>
+      <w:r>
+        <w:rPr>
+          <w:rFonts w:ascii="Times New Roman" w:hAnsi="Times New Roman" w:cs="Times New Roman"/>
+        </w:rPr>
+        <w:t xml:space="preserve"> </w:t>
       </w:r>
     </w:p>
     <w:p>
@@ -5714,7 +5896,21 @@
         <w:rPr>
           <w:rFonts w:ascii="Times New Roman" w:hAnsi="Times New Roman" w:cs="Times New Roman"/>
         </w:rPr>
-        <w:t xml:space="preserve">In the id section u must add anything u want (RECOMMAND : use small word) because we </w:t>
+        <w:t>In the id section u must add anything u want (</w:t>
+      </w:r>
+      <w:proofErr w:type="gramStart"/>
+      <w:r>
+        <w:rPr>
+          <w:rFonts w:ascii="Times New Roman" w:hAnsi="Times New Roman" w:cs="Times New Roman"/>
+        </w:rPr>
+        <w:t>RECOMMAND :</w:t>
+      </w:r>
+      <w:proofErr w:type="gramEnd"/>
+      <w:r>
+        <w:rPr>
+          <w:rFonts w:ascii="Times New Roman" w:hAnsi="Times New Roman" w:cs="Times New Roman"/>
+        </w:rPr>
+        <w:t xml:space="preserve"> use small word) because we </w:t>
       </w:r>
       <w:proofErr w:type="spellStart"/>
       <w:r>
@@ -5815,19 +6011,7 @@
         <w:rPr>
           <w:rFonts w:ascii="Times New Roman" w:hAnsi="Times New Roman" w:cs="Times New Roman"/>
         </w:rPr>
-        <w:t xml:space="preserve">Tick </w:t>
-      </w:r>
-      <w:r>
-        <w:rPr>
-          <w:rFonts w:ascii="Times New Roman" w:hAnsi="Times New Roman" w:cs="Times New Roman"/>
-        </w:rPr>
-        <w:t>Environment variables</w:t>
-      </w:r>
-      <w:r>
-        <w:rPr>
-          <w:rFonts w:ascii="Times New Roman" w:hAnsi="Times New Roman" w:cs="Times New Roman"/>
-        </w:rPr>
-        <w:t xml:space="preserve"> Square</w:t>
+        <w:t>Tick Environment variables Square</w:t>
       </w:r>
     </w:p>
     <w:p>
@@ -5848,13 +6032,7 @@
         <w:rPr>
           <w:rFonts w:ascii="Times New Roman" w:hAnsi="Times New Roman" w:cs="Times New Roman"/>
         </w:rPr>
-        <w:t>Name</w:t>
-      </w:r>
-      <w:r>
-        <w:rPr>
-          <w:rFonts w:ascii="Times New Roman" w:hAnsi="Times New Roman" w:cs="Times New Roman"/>
-        </w:rPr>
-        <w:t xml:space="preserve"> as “</w:t>
+        <w:t>Name as “</w:t>
       </w:r>
       <w:proofErr w:type="spellStart"/>
       <w:r>
@@ -5891,13 +6069,7 @@
         <w:rPr>
           <w:rFonts w:ascii="Times New Roman" w:hAnsi="Times New Roman" w:cs="Times New Roman"/>
         </w:rPr>
-        <w:t>Server URL</w:t>
-      </w:r>
-      <w:r>
-        <w:rPr>
-          <w:rFonts w:ascii="Times New Roman" w:hAnsi="Times New Roman" w:cs="Times New Roman"/>
-        </w:rPr>
-        <w:t xml:space="preserve"> as </w:t>
+        <w:t xml:space="preserve">Server URL as </w:t>
       </w:r>
       <w:hyperlink r:id="rId30" w:history="1">
         <w:r>
@@ -5927,13 +6099,7 @@
         <w:rPr>
           <w:rFonts w:ascii="Times New Roman" w:hAnsi="Times New Roman" w:cs="Times New Roman"/>
         </w:rPr>
-        <w:t>Server authentication token</w:t>
-      </w:r>
-      <w:r>
-        <w:rPr>
-          <w:rFonts w:ascii="Times New Roman" w:hAnsi="Times New Roman" w:cs="Times New Roman"/>
-        </w:rPr>
-        <w:t xml:space="preserve"> add token from credential we add it earlier</w:t>
+        <w:t>Server authentication token add token from credential we add it earlier</w:t>
       </w:r>
     </w:p>
     <w:p>
@@ -6176,6 +6342,7 @@
         </w:rPr>
       </w:pPr>
       <w:proofErr w:type="spellStart"/>
+      <w:proofErr w:type="gramStart"/>
       <w:r>
         <w:rPr>
           <w:rFonts w:ascii="Times New Roman" w:hAnsi="Times New Roman" w:cs="Times New Roman"/>
@@ -6195,9 +6362,32 @@
           <w:i/>
           <w:iCs/>
         </w:rPr>
-        <w:t>([string(</w:t>
+        <w:t>(</w:t>
+      </w:r>
+      <w:proofErr w:type="gramEnd"/>
+      <w:r>
+        <w:rPr>
+          <w:rFonts w:ascii="Times New Roman" w:hAnsi="Times New Roman" w:cs="Times New Roman"/>
+          <w:b/>
+          <w:bCs/>
+          <w:i/>
+          <w:iCs/>
+        </w:rPr>
+        <w:t>[</w:t>
+      </w:r>
+      <w:proofErr w:type="gramStart"/>
+      <w:r>
+        <w:rPr>
+          <w:rFonts w:ascii="Times New Roman" w:hAnsi="Times New Roman" w:cs="Times New Roman"/>
+          <w:b/>
+          <w:bCs/>
+          <w:i/>
+          <w:iCs/>
+        </w:rPr>
+        <w:t>string(</w:t>
       </w:r>
       <w:proofErr w:type="spellStart"/>
+      <w:proofErr w:type="gramEnd"/>
       <w:r>
         <w:rPr>
           <w:rFonts w:ascii="Times New Roman" w:hAnsi="Times New Roman" w:cs="Times New Roman"/>
@@ -6273,7 +6463,21 @@
         <w:rPr>
           <w:rFonts w:ascii="Times New Roman" w:hAnsi="Times New Roman" w:cs="Times New Roman"/>
         </w:rPr>
-        <w:t xml:space="preserve">After go to inside it go </w:t>
+        <w:t xml:space="preserve">After go to inside it </w:t>
+      </w:r>
+      <w:proofErr w:type="gramStart"/>
+      <w:r>
+        <w:rPr>
+          <w:rFonts w:ascii="Times New Roman" w:hAnsi="Times New Roman" w:cs="Times New Roman"/>
+        </w:rPr>
+        <w:t>go</w:t>
+      </w:r>
+      <w:proofErr w:type="gramEnd"/>
+      <w:r>
+        <w:rPr>
+          <w:rFonts w:ascii="Times New Roman" w:hAnsi="Times New Roman" w:cs="Times New Roman"/>
+        </w:rPr>
+        <w:t xml:space="preserve"> </w:t>
       </w:r>
       <w:r>
         <w:rPr>
@@ -6518,15 +6722,7 @@
           <w:b/>
           <w:bCs/>
         </w:rPr>
-        <w:t>Line number 3</w:t>
-      </w:r>
-      <w:r>
-        <w:rPr>
-          <w:rFonts w:ascii="Times New Roman" w:hAnsi="Times New Roman" w:cs="Times New Roman"/>
-          <w:b/>
-          <w:bCs/>
-        </w:rPr>
-        <w:t>4</w:t>
+        <w:t>Line number 34</w:t>
       </w:r>
       <w:r>
         <w:rPr>
@@ -6708,13 +6904,7 @@
         <w:rPr>
           <w:rFonts w:ascii="Times New Roman" w:hAnsi="Times New Roman" w:cs="Times New Roman"/>
         </w:rPr>
-        <w:t>Sonar scans all code in current Jenkins workspace.</w:t>
-      </w:r>
-      <w:r>
-        <w:rPr>
-          <w:rFonts w:ascii="Times New Roman" w:hAnsi="Times New Roman" w:cs="Times New Roman"/>
-        </w:rPr>
-        <w:t xml:space="preserve"> This </w:t>
+        <w:t xml:space="preserve">Sonar scans all code in current Jenkins workspace. This </w:t>
       </w:r>
       <w:r>
         <w:rPr>
@@ -6814,15 +7004,7 @@
           <w:b/>
           <w:bCs/>
         </w:rPr>
-        <w:t xml:space="preserve">8 </w:t>
-      </w:r>
-      <w:r>
-        <w:rPr>
-          <w:rFonts w:ascii="Times New Roman" w:hAnsi="Times New Roman" w:cs="Times New Roman"/>
-          <w:b/>
-          <w:bCs/>
-        </w:rPr>
-        <w:t xml:space="preserve">- </w:t>
+        <w:t xml:space="preserve">8 - </w:t>
       </w:r>
       <w:r>
         <w:rPr>
@@ -6860,15 +7042,7 @@
           <w:b/>
           <w:bCs/>
         </w:rPr>
-        <w:t>^</w:t>
-      </w:r>
-      <w:r>
-        <w:rPr>
-          <w:rFonts w:ascii="Times New Roman" w:hAnsi="Times New Roman" w:cs="Times New Roman"/>
-          <w:b/>
-          <w:bCs/>
-        </w:rPr>
-        <w:t xml:space="preserve"> means</w:t>
+        <w:t>^ means</w:t>
       </w:r>
       <w:r>
         <w:rPr>
@@ -6925,11 +7099,19 @@
       <w:r>
         <w:t xml:space="preserve"> </w:t>
       </w:r>
-      <w:r>
-        <w:rPr>
-          <w:rFonts w:ascii="Times New Roman" w:hAnsi="Times New Roman" w:cs="Times New Roman"/>
-        </w:rPr>
-        <w:t xml:space="preserve">So all lines become </w:t>
+      <w:proofErr w:type="gramStart"/>
+      <w:r>
+        <w:rPr>
+          <w:rFonts w:ascii="Times New Roman" w:hAnsi="Times New Roman" w:cs="Times New Roman"/>
+        </w:rPr>
+        <w:t>So</w:t>
+      </w:r>
+      <w:proofErr w:type="gramEnd"/>
+      <w:r>
+        <w:rPr>
+          <w:rFonts w:ascii="Times New Roman" w:hAnsi="Times New Roman" w:cs="Times New Roman"/>
+        </w:rPr>
+        <w:t xml:space="preserve"> all lines become </w:t>
       </w:r>
       <w:r>
         <w:rPr>
@@ -7134,7 +7316,21 @@
         <w:rPr>
           <w:rFonts w:ascii="Times New Roman" w:hAnsi="Times New Roman" w:cs="Times New Roman"/>
         </w:rPr>
-        <w:t xml:space="preserve"> result. But Jenkins don’t get it. Because between Jenkins and SQ </w:t>
+        <w:t xml:space="preserve"> result. But Jenkins </w:t>
+      </w:r>
+      <w:proofErr w:type="gramStart"/>
+      <w:r>
+        <w:rPr>
+          <w:rFonts w:ascii="Times New Roman" w:hAnsi="Times New Roman" w:cs="Times New Roman"/>
+        </w:rPr>
+        <w:t>don’t</w:t>
+      </w:r>
+      <w:proofErr w:type="gramEnd"/>
+      <w:r>
+        <w:rPr>
+          <w:rFonts w:ascii="Times New Roman" w:hAnsi="Times New Roman" w:cs="Times New Roman"/>
+        </w:rPr>
+        <w:t xml:space="preserve"> get it. Because between Jenkins and SQ </w:t>
       </w:r>
       <w:proofErr w:type="spellStart"/>
       <w:r>
@@ -7166,11 +7362,19 @@
           <w:rFonts w:ascii="Times New Roman" w:hAnsi="Times New Roman" w:cs="Times New Roman"/>
         </w:rPr>
       </w:pPr>
-      <w:r>
-        <w:rPr>
-          <w:rFonts w:ascii="Times New Roman" w:hAnsi="Times New Roman" w:cs="Times New Roman"/>
-        </w:rPr>
-        <w:t xml:space="preserve">So I use solution as Webhook in the </w:t>
+      <w:proofErr w:type="gramStart"/>
+      <w:r>
+        <w:rPr>
+          <w:rFonts w:ascii="Times New Roman" w:hAnsi="Times New Roman" w:cs="Times New Roman"/>
+        </w:rPr>
+        <w:t>So</w:t>
+      </w:r>
+      <w:proofErr w:type="gramEnd"/>
+      <w:r>
+        <w:rPr>
+          <w:rFonts w:ascii="Times New Roman" w:hAnsi="Times New Roman" w:cs="Times New Roman"/>
+        </w:rPr>
+        <w:t xml:space="preserve"> I use solution as Webhook in the </w:t>
       </w:r>
       <w:proofErr w:type="spellStart"/>
       <w:r>
@@ -7264,7 +7468,45 @@
         <w:rPr>
           <w:rFonts w:ascii="Times New Roman" w:hAnsi="Times New Roman" w:cs="Times New Roman"/>
         </w:rPr>
-        <w:t xml:space="preserve">, Under it u see </w:t>
+        <w:t xml:space="preserve">, </w:t>
+      </w:r>
+      <w:r>
+        <w:rPr>
+          <w:rFonts w:ascii="Times New Roman" w:hAnsi="Times New Roman" w:cs="Times New Roman"/>
+        </w:rPr>
+        <w:t>under</w:t>
+      </w:r>
+      <w:r>
+        <w:rPr>
+          <w:rFonts w:ascii="Times New Roman" w:hAnsi="Times New Roman" w:cs="Times New Roman"/>
+        </w:rPr>
+        <w:t xml:space="preserve"> </w:t>
+      </w:r>
+      <w:proofErr w:type="gramStart"/>
+      <w:r>
+        <w:rPr>
+          <w:rFonts w:ascii="Times New Roman" w:hAnsi="Times New Roman" w:cs="Times New Roman"/>
+        </w:rPr>
+        <w:t>it</w:t>
+      </w:r>
+      <w:r>
+        <w:rPr>
+          <w:rFonts w:ascii="Times New Roman" w:hAnsi="Times New Roman" w:cs="Times New Roman"/>
+        </w:rPr>
+        <w:t xml:space="preserve"> </w:t>
+      </w:r>
+      <w:r>
+        <w:rPr>
+          <w:rFonts w:ascii="Times New Roman" w:hAnsi="Times New Roman" w:cs="Times New Roman"/>
+        </w:rPr>
+        <w:t xml:space="preserve"> u</w:t>
+      </w:r>
+      <w:proofErr w:type="gramEnd"/>
+      <w:r>
+        <w:rPr>
+          <w:rFonts w:ascii="Times New Roman" w:hAnsi="Times New Roman" w:cs="Times New Roman"/>
+        </w:rPr>
+        <w:t xml:space="preserve"> see </w:t>
       </w:r>
       <w:r>
         <w:rPr>
@@ -11338,6 +11580,7 @@
   <w:style w:type="character" w:default="1" w:styleId="DefaultParagraphFont">
     <w:name w:val="Default Paragraph Font"/>
     <w:uiPriority w:val="1"/>
+    <w:semiHidden/>
     <w:unhideWhenUsed/>
   </w:style>
   <w:style w:type="table" w:default="1" w:styleId="TableNormal">

</xml_diff>